<commit_message>
Group report by slide: one frame per slide with note and transcript below
Add optional meta.json 'slides' to build_report.py; fall back to per-frame sections when absent.

Co-Authored-By: Claude Sonnet 5.5 <noreply@anthropic.com>
Claude-Session: https://claude.ai/code/session_01NCASNHWQmSkwC4SX1McnWj
</commit_message>
<xml_diff>
--- a/watch-output/2026-10-11_Facebook_AI逐字稿怎麼驗收不偷工_2小時免費體驗課__1Er8dLDmTU/2026-10-11_Facebook_AI逐字稿怎麼驗收不偷工_2小時免費體驗__1Er8dLDmTU_report.docx
+++ b/watch-output/2026-10-11_Facebook_AI逐字稿怎麼驗收不偷工_2小時免費體驗課__1Er8dLDmTU/2026-10-11_Facebook_AI逐字稿怎麼驗收不偷工_2小時免費體驗__1Er8dLDmTU_report.docx
@@ -554,7 +554,7 @@
         <w:pStyle w:val="Heading3"/>
       </w:pPr>
       <w:r>
-        <w:t>畫面 00:00–00:04</w:t>
+        <w:t>投影片 1：AI 交出的逐字稿，你怎麼知道它沒偷工？（00:00–00:04）</w:t>
       </w:r>
     </w:p>
     <w:p>
@@ -603,6 +603,23 @@
           <w:b/>
           <w:sz w:val="21"/>
         </w:rPr>
+        <w:t>重點：</w:t>
+      </w:r>
+      <w:r>
+        <w:rPr>
+          <w:rFonts w:ascii="Microsoft JhengHei" w:hAnsi="Microsoft JhengHei" w:eastAsia="Microsoft JhengHei"/>
+          <w:sz w:val="21"/>
+        </w:rPr>
+        <w:t xml:space="preserve"> 提出問題：逐字稿要做成知識庫，每個字都重要，如何確認 AI 沒有偷工減料。</w:t>
+      </w:r>
+    </w:p>
+    <w:p>
+      <w:r>
+        <w:rPr>
+          <w:rFonts w:ascii="Microsoft JhengHei" w:hAnsi="Microsoft JhengHei" w:eastAsia="Microsoft JhengHei"/>
+          <w:b/>
+          <w:sz w:val="21"/>
+        </w:rPr>
         <w:t>標籤：</w:t>
       </w:r>
       <w:r>
@@ -627,7 +644,7 @@
         <w:pStyle w:val="Heading3"/>
       </w:pPr>
       <w:r>
-        <w:t>畫面 00:04–00:07</w:t>
+        <w:t>投影片 2：別信「看起來做完了」（00:04–00:52）</w:t>
       </w:r>
     </w:p>
     <w:p>
@@ -646,7 +663,7 @@
               <a:graphicData uri="http://schemas.openxmlformats.org/drawingml/2006/picture">
                 <pic:pic>
                   <pic:nvPicPr>
-                    <pic:cNvPr id="0" name="frame_0004.jpg"/>
+                    <pic:cNvPr id="0" name="frame_0019.jpg"/>
                     <pic:cNvPicPr/>
                   </pic:nvPicPr>
                   <pic:blipFill>
@@ -673,9 +690,43 @@
       <w:r>
         <w:rPr>
           <w:rFonts w:ascii="Microsoft JhengHei" w:hAnsi="Microsoft JhengHei" w:eastAsia="Microsoft JhengHei"/>
+          <w:b/>
           <w:sz w:val="21"/>
         </w:rPr>
-        <w:t>我要能夠盡量把原文留下來。</w:t>
+        <w:t>重點：</w:t>
+      </w:r>
+      <w:r>
+        <w:rPr>
+          <w:rFonts w:ascii="Microsoft JhengHei" w:hAnsi="Microsoft JhengHei" w:eastAsia="Microsoft JhengHei"/>
+          <w:sz w:val="21"/>
+        </w:rPr>
+        <w:t xml:space="preserve"> 四道關卡：逐字保留、分段處理、雙指標自我檢查、不覆寫原檔；轉成 MD 檔時要盡量保留原文，長音檔要分段、行數與字數都要達標。</w:t>
+      </w:r>
+    </w:p>
+    <w:p>
+      <w:r>
+        <w:rPr>
+          <w:rFonts w:ascii="Microsoft JhengHei" w:hAnsi="Microsoft JhengHei" w:eastAsia="Microsoft JhengHei"/>
+          <w:b/>
+          <w:sz w:val="21"/>
+        </w:rPr>
+        <w:t>標籤：</w:t>
+      </w:r>
+      <w:r>
+        <w:rPr>
+          <w:rFonts w:ascii="Microsoft JhengHei" w:hAnsi="Microsoft JhengHei" w:eastAsia="Microsoft JhengHei"/>
+          <w:sz w:val="21"/>
+        </w:rPr>
+        <w:t xml:space="preserve"> #逐字保留 #分段處理 #雙指標 #不覆寫原檔</w:t>
+      </w:r>
+    </w:p>
+    <w:p>
+      <w:r>
+        <w:rPr>
+          <w:rFonts w:ascii="Microsoft JhengHei" w:hAnsi="Microsoft JhengHei" w:eastAsia="Microsoft JhengHei"/>
+          <w:sz w:val="21"/>
+        </w:rPr>
+        <w:t>我要能夠盡量把原文留下來，既然這個東西它有我做成知識庫的價值，每一個字就是都很重要，很有價值的東西會在某些例子的細節裡面，它可能很多的故事的細節就會被刪掉了，我覺得最厲害、最Juicy的地方就不見了，如果我想要轉成MD檔的東西，我都會希望它盡量保留成原文，一定要逐字保留，這是一個大原則，如果你真的要拿來做很長的檔案的話，後面逐字稿要分段處理，不會一次做一個大段，這東西都不用做，因為我都已經寫在技能包裡面了，這是我的思路，怎麼去拆解這個比較長的音檔，我後面裡面有做的就是雙指標的自我檢查，就是行數跟字數都要達標這個音檔有多長，它應該要有的容量跟行數字數大概是什麼。</w:t>
       </w:r>
     </w:p>
     <w:p>
@@ -683,7 +734,7 @@
         <w:pStyle w:val="Heading3"/>
       </w:pPr>
       <w:r>
-        <w:t>畫面 00:07–00:10</w:t>
+        <w:t>投影片 3：第一版，就要完美嗎？（00:52–01:09）</w:t>
       </w:r>
     </w:p>
     <w:p>
@@ -702,7 +753,7 @@
               <a:graphicData uri="http://schemas.openxmlformats.org/drawingml/2006/picture">
                 <pic:pic>
                   <pic:nvPicPr>
-                    <pic:cNvPr id="0" name="frame_0006.jpg"/>
+                    <pic:cNvPr id="0" name="frame_0038.jpg"/>
                     <pic:cNvPicPr/>
                   </pic:nvPicPr>
                   <pic:blipFill>
@@ -729,9 +780,43 @@
       <w:r>
         <w:rPr>
           <w:rFonts w:ascii="Microsoft JhengHei" w:hAnsi="Microsoft JhengHei" w:eastAsia="Microsoft JhengHei"/>
+          <w:b/>
           <w:sz w:val="21"/>
         </w:rPr>
-        <w:t>既然這個東西它有我做成知識庫的價值，每一個字就是都很重要。</w:t>
+        <w:t>重點：</w:t>
+      </w:r>
+      <w:r>
+        <w:rPr>
+          <w:rFonts w:ascii="Microsoft JhengHei" w:hAnsi="Microsoft JhengHei" w:eastAsia="Microsoft JhengHei"/>
+          <w:sz w:val="21"/>
+        </w:rPr>
+        <w:t xml:space="preserve"> 技能包不必一次到位，是「永遠在改的進行式」：發現問題就修改，滿意後定稿成下一版。</w:t>
+      </w:r>
+    </w:p>
+    <w:p>
+      <w:r>
+        <w:rPr>
+          <w:rFonts w:ascii="Microsoft JhengHei" w:hAnsi="Microsoft JhengHei" w:eastAsia="Microsoft JhengHei"/>
+          <w:b/>
+          <w:sz w:val="21"/>
+        </w:rPr>
+        <w:t>標籤：</w:t>
+      </w:r>
+      <w:r>
+        <w:rPr>
+          <w:rFonts w:ascii="Microsoft JhengHei" w:hAnsi="Microsoft JhengHei" w:eastAsia="Microsoft JhengHei"/>
+          <w:sz w:val="21"/>
+        </w:rPr>
+        <w:t xml:space="preserve"> #技能包 #迭代</w:t>
+      </w:r>
+    </w:p>
+    <w:p>
+      <w:r>
+        <w:rPr>
+          <w:rFonts w:ascii="Microsoft JhengHei" w:hAnsi="Microsoft JhengHei" w:eastAsia="Microsoft JhengHei"/>
+          <w:sz w:val="21"/>
+        </w:rPr>
+        <w:t>這邊另外有一個重點想跟大家分享就是，不要想說一次做技能包就要到位，最棒的技能包就是一個永遠正在改的進行式的技能包，然後你只要一知道他做的哪裡不好就修改他，修改完之後覺得好就叫他把它定稿成為下一個版本，然後就一直不斷最佳化。</w:t>
       </w:r>
     </w:p>
     <w:p>
@@ -739,7 +824,7 @@
         <w:pStyle w:val="Heading3"/>
       </w:pPr>
       <w:r>
-        <w:t>畫面 00:10–00:16</w:t>
+        <w:t>投影片 4：先求能用，再求完美（01:09–01:12）</w:t>
       </w:r>
     </w:p>
     <w:p>
@@ -758,7 +843,7 @@
               <a:graphicData uri="http://schemas.openxmlformats.org/drawingml/2006/picture">
                 <pic:pic>
                   <pic:nvPicPr>
-                    <pic:cNvPr id="0" name="frame_0008.jpg"/>
+                    <pic:cNvPr id="0" name="frame_0049.jpg"/>
                     <pic:cNvPicPr/>
                   </pic:nvPicPr>
                   <pic:blipFill>
@@ -785,9 +870,43 @@
       <w:r>
         <w:rPr>
           <w:rFonts w:ascii="Microsoft JhengHei" w:hAnsi="Microsoft JhengHei" w:eastAsia="Microsoft JhengHei"/>
+          <w:b/>
           <w:sz w:val="21"/>
         </w:rPr>
-        <w:t>很有價值的東西會在某些例子的細節裡面，它可能很多的故事的細節就會被刪掉了。</w:t>
+        <w:t>重點：</w:t>
+      </w:r>
+      <w:r>
+        <w:rPr>
+          <w:rFonts w:ascii="Microsoft JhengHei" w:hAnsi="Microsoft JhengHei" w:eastAsia="Microsoft JhengHei"/>
+          <w:sz w:val="21"/>
+        </w:rPr>
+        <w:t xml:space="preserve"> 講者的技能包不斷最佳化，已做到約 20 版。</w:t>
+      </w:r>
+    </w:p>
+    <w:p>
+      <w:r>
+        <w:rPr>
+          <w:rFonts w:ascii="Microsoft JhengHei" w:hAnsi="Microsoft JhengHei" w:eastAsia="Microsoft JhengHei"/>
+          <w:b/>
+          <w:sz w:val="21"/>
+        </w:rPr>
+        <w:t>標籤：</w:t>
+      </w:r>
+      <w:r>
+        <w:rPr>
+          <w:rFonts w:ascii="Microsoft JhengHei" w:hAnsi="Microsoft JhengHei" w:eastAsia="Microsoft JhengHei"/>
+          <w:sz w:val="21"/>
+        </w:rPr>
+        <w:t xml:space="preserve"> #最佳化</w:t>
+      </w:r>
+    </w:p>
+    <w:p>
+      <w:r>
+        <w:rPr>
+          <w:rFonts w:ascii="Microsoft JhengHei" w:hAnsi="Microsoft JhengHei" w:eastAsia="Microsoft JhengHei"/>
+          <w:sz w:val="21"/>
+        </w:rPr>
+        <w:t>其實我們一直不斷的在最佳化好幾個版後來做到20版。</w:t>
       </w:r>
     </w:p>
     <w:p>
@@ -795,7 +914,7 @@
         <w:pStyle w:val="Heading3"/>
       </w:pPr>
       <w:r>
-        <w:t>畫面 00:16–00:26</w:t>
+        <w:t>投影片 5：帶走：先問對問題，再分工・驗收・迭代（01:12–01:24）</w:t>
       </w:r>
     </w:p>
     <w:p>
@@ -814,7 +933,7 @@
               <a:graphicData uri="http://schemas.openxmlformats.org/drawingml/2006/picture">
                 <pic:pic>
                   <pic:nvPicPr>
-                    <pic:cNvPr id="0" name="frame_0012.jpg"/>
+                    <pic:cNvPr id="0" name="frame_0052.jpg"/>
                     <pic:cNvPicPr/>
                   </pic:nvPicPr>
                   <pic:blipFill>
@@ -841,9 +960,43 @@
       <w:r>
         <w:rPr>
           <w:rFonts w:ascii="Microsoft JhengHei" w:hAnsi="Microsoft JhengHei" w:eastAsia="Microsoft JhengHei"/>
+          <w:b/>
           <w:sz w:val="21"/>
         </w:rPr>
-        <w:t>我覺得最厲害、最Juicy的地方就不見了，如果我想要轉成MD檔的東西，我都會希望它盡量保留成原文，一定要逐字保留，這是一個大原則。</w:t>
+        <w:t>重點：</w:t>
+      </w:r>
+      <w:r>
+        <w:rPr>
+          <w:rFonts w:ascii="Microsoft JhengHei" w:hAnsi="Microsoft JhengHei" w:eastAsia="Microsoft JhengHei"/>
+          <w:sz w:val="21"/>
+        </w:rPr>
+        <w:t xml:space="preserve"> 流程為先問對問題 → 分工 → 驗收 → 迭代；挑自己的一段音檔，用同一招跑一次。</w:t>
+      </w:r>
+    </w:p>
+    <w:p>
+      <w:r>
+        <w:rPr>
+          <w:rFonts w:ascii="Microsoft JhengHei" w:hAnsi="Microsoft JhengHei" w:eastAsia="Microsoft JhengHei"/>
+          <w:b/>
+          <w:sz w:val="21"/>
+        </w:rPr>
+        <w:t>標籤：</w:t>
+      </w:r>
+      <w:r>
+        <w:rPr>
+          <w:rFonts w:ascii="Microsoft JhengHei" w:hAnsi="Microsoft JhengHei" w:eastAsia="Microsoft JhengHei"/>
+          <w:sz w:val="21"/>
+        </w:rPr>
+        <w:t xml:space="preserve"> #問對問題 #分工驗收迭代</w:t>
+      </w:r>
+    </w:p>
+    <w:p>
+      <w:r>
+        <w:rPr>
+          <w:rFonts w:ascii="Microsoft JhengHei" w:hAnsi="Microsoft JhengHei" w:eastAsia="Microsoft JhengHei"/>
+          <w:sz w:val="21"/>
+        </w:rPr>
+        <w:t>所以大概的流程就會是，先問對問題、分工、驗收、迭代這樣子，8點半大家看到那個文章上線的時候，就可以直接下載下來找一個音檔來自己測試看看。</w:t>
       </w:r>
     </w:p>
     <w:p>
@@ -851,7 +1004,7 @@
         <w:pStyle w:val="Heading3"/>
       </w:pPr>
       <w:r>
-        <w:t>畫面 00:26–00:35</w:t>
+        <w:t>投影片 6：結尾：報名免費體驗課（01:24–01:26）</w:t>
       </w:r>
     </w:p>
     <w:p>
@@ -870,7 +1023,7 @@
               <a:graphicData uri="http://schemas.openxmlformats.org/drawingml/2006/picture">
                 <pic:pic>
                   <pic:nvPicPr>
-                    <pic:cNvPr id="0" name="frame_0019.jpg"/>
+                    <pic:cNvPr id="0" name="frame_0059.jpg"/>
                     <pic:cNvPicPr/>
                   </pic:nvPicPr>
                   <pic:blipFill>
@@ -897,737 +1050,17 @@
       <w:r>
         <w:rPr>
           <w:rFonts w:ascii="Microsoft JhengHei" w:hAnsi="Microsoft JhengHei" w:eastAsia="Microsoft JhengHei"/>
+          <w:b/>
           <w:sz w:val="21"/>
         </w:rPr>
-        <w:t>如果你真的要拿來做很長的檔案的話，後面逐字稿要分段處理，不會一次做一個大段。</w:t>
+        <w:t>重點：</w:t>
       </w:r>
-    </w:p>
-    <w:p>
-      <w:pPr>
-        <w:pStyle w:val="Heading3"/>
-      </w:pPr>
-      <w:r>
-        <w:t>畫面 00:35–00:36</w:t>
-      </w:r>
-    </w:p>
-    <w:p>
-      <w:pPr>
-        <w:jc w:val="center"/>
-      </w:pPr>
-      <w:r>
-        <w:drawing>
-          <wp:inline xmlns:a="http://schemas.openxmlformats.org/drawingml/2006/main" xmlns:pic="http://schemas.openxmlformats.org/drawingml/2006/picture">
-            <wp:extent cx="4320000" cy="2430000"/>
-            <wp:docPr id="7" name="Picture 7"/>
-            <wp:cNvGraphicFramePr>
-              <a:graphicFrameLocks noChangeAspect="1"/>
-            </wp:cNvGraphicFramePr>
-            <a:graphic>
-              <a:graphicData uri="http://schemas.openxmlformats.org/drawingml/2006/picture">
-                <pic:pic>
-                  <pic:nvPicPr>
-                    <pic:cNvPr id="0" name="frame_0025.jpg"/>
-                    <pic:cNvPicPr/>
-                  </pic:nvPicPr>
-                  <pic:blipFill>
-                    <a:blip r:embed="rId16"/>
-                    <a:stretch>
-                      <a:fillRect/>
-                    </a:stretch>
-                  </pic:blipFill>
-                  <pic:spPr>
-                    <a:xfrm>
-                      <a:off x="0" y="0"/>
-                      <a:ext cx="4320000" cy="2430000"/>
-                    </a:xfrm>
-                    <a:prstGeom prst="rect"/>
-                  </pic:spPr>
-                </pic:pic>
-              </a:graphicData>
-            </a:graphic>
-          </wp:inline>
-        </w:drawing>
-      </w:r>
-    </w:p>
-    <w:p>
       <w:r>
         <w:rPr>
           <w:rFonts w:ascii="Microsoft JhengHei" w:hAnsi="Microsoft JhengHei" w:eastAsia="Microsoft JhengHei"/>
           <w:sz w:val="21"/>
         </w:rPr>
-        <w:t>這東西都不用做，因為我都已經寫在技能包裡面了。</w:t>
-      </w:r>
-    </w:p>
-    <w:p>
-      <w:pPr>
-        <w:pStyle w:val="Heading3"/>
-      </w:pPr>
-      <w:r>
-        <w:t>畫面 00:36–00:39</w:t>
-      </w:r>
-    </w:p>
-    <w:p>
-      <w:pPr>
-        <w:jc w:val="center"/>
-      </w:pPr>
-      <w:r>
-        <w:drawing>
-          <wp:inline xmlns:a="http://schemas.openxmlformats.org/drawingml/2006/main" xmlns:pic="http://schemas.openxmlformats.org/drawingml/2006/picture">
-            <wp:extent cx="4320000" cy="2430000"/>
-            <wp:docPr id="8" name="Picture 8"/>
-            <wp:cNvGraphicFramePr>
-              <a:graphicFrameLocks noChangeAspect="1"/>
-            </wp:cNvGraphicFramePr>
-            <a:graphic>
-              <a:graphicData uri="http://schemas.openxmlformats.org/drawingml/2006/picture">
-                <pic:pic>
-                  <pic:nvPicPr>
-                    <pic:cNvPr id="0" name="frame_0026.jpg"/>
-                    <pic:cNvPicPr/>
-                  </pic:nvPicPr>
-                  <pic:blipFill>
-                    <a:blip r:embed="rId17"/>
-                    <a:stretch>
-                      <a:fillRect/>
-                    </a:stretch>
-                  </pic:blipFill>
-                  <pic:spPr>
-                    <a:xfrm>
-                      <a:off x="0" y="0"/>
-                      <a:ext cx="4320000" cy="2430000"/>
-                    </a:xfrm>
-                    <a:prstGeom prst="rect"/>
-                  </pic:spPr>
-                </pic:pic>
-              </a:graphicData>
-            </a:graphic>
-          </wp:inline>
-        </w:drawing>
-      </w:r>
-    </w:p>
-    <w:p>
-      <w:r>
-        <w:rPr>
-          <w:rFonts w:ascii="Microsoft JhengHei" w:hAnsi="Microsoft JhengHei" w:eastAsia="Microsoft JhengHei"/>
-          <w:sz w:val="21"/>
-        </w:rPr>
-        <w:t>這是我的思路，怎麼去拆解這個比較長的音檔。</w:t>
-      </w:r>
-    </w:p>
-    <w:p>
-      <w:pPr>
-        <w:pStyle w:val="Heading3"/>
-      </w:pPr>
-      <w:r>
-        <w:t>畫面 00:39–00:43</w:t>
-      </w:r>
-    </w:p>
-    <w:p>
-      <w:pPr>
-        <w:jc w:val="center"/>
-      </w:pPr>
-      <w:r>
-        <w:drawing>
-          <wp:inline xmlns:a="http://schemas.openxmlformats.org/drawingml/2006/main" xmlns:pic="http://schemas.openxmlformats.org/drawingml/2006/picture">
-            <wp:extent cx="4320000" cy="2430000"/>
-            <wp:docPr id="9" name="Picture 9"/>
-            <wp:cNvGraphicFramePr>
-              <a:graphicFrameLocks noChangeAspect="1"/>
-            </wp:cNvGraphicFramePr>
-            <a:graphic>
-              <a:graphicData uri="http://schemas.openxmlformats.org/drawingml/2006/picture">
-                <pic:pic>
-                  <pic:nvPicPr>
-                    <pic:cNvPr id="0" name="frame_0028.jpg"/>
-                    <pic:cNvPicPr/>
-                  </pic:nvPicPr>
-                  <pic:blipFill>
-                    <a:blip r:embed="rId18"/>
-                    <a:stretch>
-                      <a:fillRect/>
-                    </a:stretch>
-                  </pic:blipFill>
-                  <pic:spPr>
-                    <a:xfrm>
-                      <a:off x="0" y="0"/>
-                      <a:ext cx="4320000" cy="2430000"/>
-                    </a:xfrm>
-                    <a:prstGeom prst="rect"/>
-                  </pic:spPr>
-                </pic:pic>
-              </a:graphicData>
-            </a:graphic>
-          </wp:inline>
-        </w:drawing>
-      </w:r>
-    </w:p>
-    <w:p>
-      <w:r>
-        <w:rPr>
-          <w:rFonts w:ascii="Microsoft JhengHei" w:hAnsi="Microsoft JhengHei" w:eastAsia="Microsoft JhengHei"/>
-          <w:sz w:val="21"/>
-        </w:rPr>
-        <w:t>我後面裡面有做的就是雙指標的自我檢查。</w:t>
-      </w:r>
-    </w:p>
-    <w:p>
-      <w:pPr>
-        <w:pStyle w:val="Heading3"/>
-      </w:pPr>
-      <w:r>
-        <w:t>畫面 00:43–00:50</w:t>
-      </w:r>
-    </w:p>
-    <w:p>
-      <w:pPr>
-        <w:jc w:val="center"/>
-      </w:pPr>
-      <w:r>
-        <w:drawing>
-          <wp:inline xmlns:a="http://schemas.openxmlformats.org/drawingml/2006/main" xmlns:pic="http://schemas.openxmlformats.org/drawingml/2006/picture">
-            <wp:extent cx="4320000" cy="2430000"/>
-            <wp:docPr id="10" name="Picture 10"/>
-            <wp:cNvGraphicFramePr>
-              <a:graphicFrameLocks noChangeAspect="1"/>
-            </wp:cNvGraphicFramePr>
-            <a:graphic>
-              <a:graphicData uri="http://schemas.openxmlformats.org/drawingml/2006/picture">
-                <pic:pic>
-                  <pic:nvPicPr>
-                    <pic:cNvPr id="0" name="frame_0031.jpg"/>
-                    <pic:cNvPicPr/>
-                  </pic:nvPicPr>
-                  <pic:blipFill>
-                    <a:blip r:embed="rId19"/>
-                    <a:stretch>
-                      <a:fillRect/>
-                    </a:stretch>
-                  </pic:blipFill>
-                  <pic:spPr>
-                    <a:xfrm>
-                      <a:off x="0" y="0"/>
-                      <a:ext cx="4320000" cy="2430000"/>
-                    </a:xfrm>
-                    <a:prstGeom prst="rect"/>
-                  </pic:spPr>
-                </pic:pic>
-              </a:graphicData>
-            </a:graphic>
-          </wp:inline>
-        </w:drawing>
-      </w:r>
-    </w:p>
-    <w:p>
-      <w:r>
-        <w:rPr>
-          <w:rFonts w:ascii="Microsoft JhengHei" w:hAnsi="Microsoft JhengHei" w:eastAsia="Microsoft JhengHei"/>
-          <w:sz w:val="21"/>
-        </w:rPr>
-        <w:t>就是行數跟字數都要達標這個音檔有多長，它應該要有的容量跟行數字數大概是什麼。</w:t>
-      </w:r>
-    </w:p>
-    <w:p>
-      <w:pPr>
-        <w:pStyle w:val="Heading3"/>
-      </w:pPr>
-      <w:r>
-        <w:t>畫面 00:50–00:53</w:t>
-      </w:r>
-    </w:p>
-    <w:p>
-      <w:pPr>
-        <w:jc w:val="center"/>
-      </w:pPr>
-      <w:r>
-        <w:drawing>
-          <wp:inline xmlns:a="http://schemas.openxmlformats.org/drawingml/2006/main" xmlns:pic="http://schemas.openxmlformats.org/drawingml/2006/picture">
-            <wp:extent cx="4320000" cy="2430000"/>
-            <wp:docPr id="11" name="Picture 11"/>
-            <wp:cNvGraphicFramePr>
-              <a:graphicFrameLocks noChangeAspect="1"/>
-            </wp:cNvGraphicFramePr>
-            <a:graphic>
-              <a:graphicData uri="http://schemas.openxmlformats.org/drawingml/2006/picture">
-                <pic:pic>
-                  <pic:nvPicPr>
-                    <pic:cNvPr id="0" name="frame_0036.jpg"/>
-                    <pic:cNvPicPr/>
-                  </pic:nvPicPr>
-                  <pic:blipFill>
-                    <a:blip r:embed="rId20"/>
-                    <a:stretch>
-                      <a:fillRect/>
-                    </a:stretch>
-                  </pic:blipFill>
-                  <pic:spPr>
-                    <a:xfrm>
-                      <a:off x="0" y="0"/>
-                      <a:ext cx="4320000" cy="2430000"/>
-                    </a:xfrm>
-                    <a:prstGeom prst="rect"/>
-                  </pic:spPr>
-                </pic:pic>
-              </a:graphicData>
-            </a:graphic>
-          </wp:inline>
-        </w:drawing>
-      </w:r>
-    </w:p>
-    <w:p>
-      <w:r>
-        <w:rPr>
-          <w:rFonts w:ascii="Microsoft JhengHei" w:hAnsi="Microsoft JhengHei" w:eastAsia="Microsoft JhengHei"/>
-          <w:sz w:val="21"/>
-        </w:rPr>
-        <w:t>這邊另外有一個重點想跟大家分享就是。</w:t>
-      </w:r>
-    </w:p>
-    <w:p>
-      <w:pPr>
-        <w:pStyle w:val="Heading3"/>
-      </w:pPr>
-      <w:r>
-        <w:t>畫面 00:53–00:56</w:t>
-      </w:r>
-    </w:p>
-    <w:p>
-      <w:pPr>
-        <w:jc w:val="center"/>
-      </w:pPr>
-      <w:r>
-        <w:drawing>
-          <wp:inline xmlns:a="http://schemas.openxmlformats.org/drawingml/2006/main" xmlns:pic="http://schemas.openxmlformats.org/drawingml/2006/picture">
-            <wp:extent cx="4320000" cy="2430000"/>
-            <wp:docPr id="12" name="Picture 12"/>
-            <wp:cNvGraphicFramePr>
-              <a:graphicFrameLocks noChangeAspect="1"/>
-            </wp:cNvGraphicFramePr>
-            <a:graphic>
-              <a:graphicData uri="http://schemas.openxmlformats.org/drawingml/2006/picture">
-                <pic:pic>
-                  <pic:nvPicPr>
-                    <pic:cNvPr id="0" name="frame_0038.jpg"/>
-                    <pic:cNvPicPr/>
-                  </pic:nvPicPr>
-                  <pic:blipFill>
-                    <a:blip r:embed="rId21"/>
-                    <a:stretch>
-                      <a:fillRect/>
-                    </a:stretch>
-                  </pic:blipFill>
-                  <pic:spPr>
-                    <a:xfrm>
-                      <a:off x="0" y="0"/>
-                      <a:ext cx="4320000" cy="2430000"/>
-                    </a:xfrm>
-                    <a:prstGeom prst="rect"/>
-                  </pic:spPr>
-                </pic:pic>
-              </a:graphicData>
-            </a:graphic>
-          </wp:inline>
-        </w:drawing>
-      </w:r>
-    </w:p>
-    <w:p>
-      <w:r>
-        <w:rPr>
-          <w:rFonts w:ascii="Microsoft JhengHei" w:hAnsi="Microsoft JhengHei" w:eastAsia="Microsoft JhengHei"/>
-          <w:sz w:val="21"/>
-        </w:rPr>
-        <w:t>不要想說一次做技能包就要到位。</w:t>
-      </w:r>
-    </w:p>
-    <w:p>
-      <w:pPr>
-        <w:pStyle w:val="Heading3"/>
-      </w:pPr>
-      <w:r>
-        <w:t>畫面 00:56–01:02</w:t>
-      </w:r>
-    </w:p>
-    <w:p>
-      <w:pPr>
-        <w:jc w:val="center"/>
-      </w:pPr>
-      <w:r>
-        <w:drawing>
-          <wp:inline xmlns:a="http://schemas.openxmlformats.org/drawingml/2006/main" xmlns:pic="http://schemas.openxmlformats.org/drawingml/2006/picture">
-            <wp:extent cx="4320000" cy="2430000"/>
-            <wp:docPr id="13" name="Picture 13"/>
-            <wp:cNvGraphicFramePr>
-              <a:graphicFrameLocks noChangeAspect="1"/>
-            </wp:cNvGraphicFramePr>
-            <a:graphic>
-              <a:graphicData uri="http://schemas.openxmlformats.org/drawingml/2006/picture">
-                <pic:pic>
-                  <pic:nvPicPr>
-                    <pic:cNvPr id="0" name="frame_0040.jpg"/>
-                    <pic:cNvPicPr/>
-                  </pic:nvPicPr>
-                  <pic:blipFill>
-                    <a:blip r:embed="rId22"/>
-                    <a:stretch>
-                      <a:fillRect/>
-                    </a:stretch>
-                  </pic:blipFill>
-                  <pic:spPr>
-                    <a:xfrm>
-                      <a:off x="0" y="0"/>
-                      <a:ext cx="4320000" cy="2430000"/>
-                    </a:xfrm>
-                    <a:prstGeom prst="rect"/>
-                  </pic:spPr>
-                </pic:pic>
-              </a:graphicData>
-            </a:graphic>
-          </wp:inline>
-        </w:drawing>
-      </w:r>
-    </w:p>
-    <w:p>
-      <w:r>
-        <w:rPr>
-          <w:rFonts w:ascii="Microsoft JhengHei" w:hAnsi="Microsoft JhengHei" w:eastAsia="Microsoft JhengHei"/>
-          <w:sz w:val="21"/>
-        </w:rPr>
-        <w:t>最棒的技能包就是一個永遠正在改的進行式的技能包，然後你只要一知道他做的哪裡不好就修改他。</w:t>
-      </w:r>
-    </w:p>
-    <w:p>
-      <w:pPr>
-        <w:pStyle w:val="Heading3"/>
-      </w:pPr>
-      <w:r>
-        <w:t>畫面 01:02–01:06</w:t>
-      </w:r>
-    </w:p>
-    <w:p>
-      <w:pPr>
-        <w:jc w:val="center"/>
-      </w:pPr>
-      <w:r>
-        <w:drawing>
-          <wp:inline xmlns:a="http://schemas.openxmlformats.org/drawingml/2006/main" xmlns:pic="http://schemas.openxmlformats.org/drawingml/2006/picture">
-            <wp:extent cx="4320000" cy="2430000"/>
-            <wp:docPr id="14" name="Picture 14"/>
-            <wp:cNvGraphicFramePr>
-              <a:graphicFrameLocks noChangeAspect="1"/>
-            </wp:cNvGraphicFramePr>
-            <a:graphic>
-              <a:graphicData uri="http://schemas.openxmlformats.org/drawingml/2006/picture">
-                <pic:pic>
-                  <pic:nvPicPr>
-                    <pic:cNvPr id="0" name="frame_0044.jpg"/>
-                    <pic:cNvPicPr/>
-                  </pic:nvPicPr>
-                  <pic:blipFill>
-                    <a:blip r:embed="rId23"/>
-                    <a:stretch>
-                      <a:fillRect/>
-                    </a:stretch>
-                  </pic:blipFill>
-                  <pic:spPr>
-                    <a:xfrm>
-                      <a:off x="0" y="0"/>
-                      <a:ext cx="4320000" cy="2430000"/>
-                    </a:xfrm>
-                    <a:prstGeom prst="rect"/>
-                  </pic:spPr>
-                </pic:pic>
-              </a:graphicData>
-            </a:graphic>
-          </wp:inline>
-        </w:drawing>
-      </w:r>
-    </w:p>
-    <w:p>
-      <w:r>
-        <w:rPr>
-          <w:rFonts w:ascii="Microsoft JhengHei" w:hAnsi="Microsoft JhengHei" w:eastAsia="Microsoft JhengHei"/>
-          <w:sz w:val="21"/>
-        </w:rPr>
-        <w:t>修改完之後覺得好就叫他把它定稿成為下一個版本。</w:t>
-      </w:r>
-    </w:p>
-    <w:p>
-      <w:pPr>
-        <w:pStyle w:val="Heading3"/>
-      </w:pPr>
-      <w:r>
-        <w:t>畫面 01:06–01:09</w:t>
-      </w:r>
-    </w:p>
-    <w:p>
-      <w:pPr>
-        <w:jc w:val="center"/>
-      </w:pPr>
-      <w:r>
-        <w:drawing>
-          <wp:inline xmlns:a="http://schemas.openxmlformats.org/drawingml/2006/main" xmlns:pic="http://schemas.openxmlformats.org/drawingml/2006/picture">
-            <wp:extent cx="4320000" cy="2430000"/>
-            <wp:docPr id="15" name="Picture 15"/>
-            <wp:cNvGraphicFramePr>
-              <a:graphicFrameLocks noChangeAspect="1"/>
-            </wp:cNvGraphicFramePr>
-            <a:graphic>
-              <a:graphicData uri="http://schemas.openxmlformats.org/drawingml/2006/picture">
-                <pic:pic>
-                  <pic:nvPicPr>
-                    <pic:cNvPr id="0" name="frame_0047.jpg"/>
-                    <pic:cNvPicPr/>
-                  </pic:nvPicPr>
-                  <pic:blipFill>
-                    <a:blip r:embed="rId24"/>
-                    <a:stretch>
-                      <a:fillRect/>
-                    </a:stretch>
-                  </pic:blipFill>
-                  <pic:spPr>
-                    <a:xfrm>
-                      <a:off x="0" y="0"/>
-                      <a:ext cx="4320000" cy="2430000"/>
-                    </a:xfrm>
-                    <a:prstGeom prst="rect"/>
-                  </pic:spPr>
-                </pic:pic>
-              </a:graphicData>
-            </a:graphic>
-          </wp:inline>
-        </w:drawing>
-      </w:r>
-    </w:p>
-    <w:p>
-      <w:r>
-        <w:rPr>
-          <w:rFonts w:ascii="Microsoft JhengHei" w:hAnsi="Microsoft JhengHei" w:eastAsia="Microsoft JhengHei"/>
-          <w:sz w:val="21"/>
-        </w:rPr>
-        <w:t>然後就一直不斷最佳化。</w:t>
-      </w:r>
-    </w:p>
-    <w:p>
-      <w:pPr>
-        <w:pStyle w:val="Heading3"/>
-      </w:pPr>
-      <w:r>
-        <w:t>畫面 01:09–01:13</w:t>
-      </w:r>
-    </w:p>
-    <w:p>
-      <w:pPr>
-        <w:jc w:val="center"/>
-      </w:pPr>
-      <w:r>
-        <w:drawing>
-          <wp:inline xmlns:a="http://schemas.openxmlformats.org/drawingml/2006/main" xmlns:pic="http://schemas.openxmlformats.org/drawingml/2006/picture">
-            <wp:extent cx="4320000" cy="2430000"/>
-            <wp:docPr id="16" name="Picture 16"/>
-            <wp:cNvGraphicFramePr>
-              <a:graphicFrameLocks noChangeAspect="1"/>
-            </wp:cNvGraphicFramePr>
-            <a:graphic>
-              <a:graphicData uri="http://schemas.openxmlformats.org/drawingml/2006/picture">
-                <pic:pic>
-                  <pic:nvPicPr>
-                    <pic:cNvPr id="0" name="frame_0049.jpg"/>
-                    <pic:cNvPicPr/>
-                  </pic:nvPicPr>
-                  <pic:blipFill>
-                    <a:blip r:embed="rId25"/>
-                    <a:stretch>
-                      <a:fillRect/>
-                    </a:stretch>
-                  </pic:blipFill>
-                  <pic:spPr>
-                    <a:xfrm>
-                      <a:off x="0" y="0"/>
-                      <a:ext cx="4320000" cy="2430000"/>
-                    </a:xfrm>
-                    <a:prstGeom prst="rect"/>
-                  </pic:spPr>
-                </pic:pic>
-              </a:graphicData>
-            </a:graphic>
-          </wp:inline>
-        </w:drawing>
-      </w:r>
-    </w:p>
-    <w:p>
-      <w:r>
-        <w:rPr>
-          <w:rFonts w:ascii="Microsoft JhengHei" w:hAnsi="Microsoft JhengHei" w:eastAsia="Microsoft JhengHei"/>
-          <w:sz w:val="21"/>
-        </w:rPr>
-        <w:t>其實我們一直不斷的在最佳化好幾個版後來做到20版，所以大概的流程就會是。</w:t>
-      </w:r>
-    </w:p>
-    <w:p>
-      <w:pPr>
-        <w:pStyle w:val="Heading3"/>
-      </w:pPr>
-      <w:r>
-        <w:t>畫面 01:13–01:16</w:t>
-      </w:r>
-    </w:p>
-    <w:p>
-      <w:pPr>
-        <w:jc w:val="center"/>
-      </w:pPr>
-      <w:r>
-        <w:drawing>
-          <wp:inline xmlns:a="http://schemas.openxmlformats.org/drawingml/2006/main" xmlns:pic="http://schemas.openxmlformats.org/drawingml/2006/picture">
-            <wp:extent cx="4320000" cy="2430000"/>
-            <wp:docPr id="17" name="Picture 17"/>
-            <wp:cNvGraphicFramePr>
-              <a:graphicFrameLocks noChangeAspect="1"/>
-            </wp:cNvGraphicFramePr>
-            <a:graphic>
-              <a:graphicData uri="http://schemas.openxmlformats.org/drawingml/2006/picture">
-                <pic:pic>
-                  <pic:nvPicPr>
-                    <pic:cNvPr id="0" name="frame_0052.jpg"/>
-                    <pic:cNvPicPr/>
-                  </pic:nvPicPr>
-                  <pic:blipFill>
-                    <a:blip r:embed="rId26"/>
-                    <a:stretch>
-                      <a:fillRect/>
-                    </a:stretch>
-                  </pic:blipFill>
-                  <pic:spPr>
-                    <a:xfrm>
-                      <a:off x="0" y="0"/>
-                      <a:ext cx="4320000" cy="2430000"/>
-                    </a:xfrm>
-                    <a:prstGeom prst="rect"/>
-                  </pic:spPr>
-                </pic:pic>
-              </a:graphicData>
-            </a:graphic>
-          </wp:inline>
-        </w:drawing>
-      </w:r>
-    </w:p>
-    <w:p>
-      <w:r>
-        <w:rPr>
-          <w:rFonts w:ascii="Microsoft JhengHei" w:hAnsi="Microsoft JhengHei" w:eastAsia="Microsoft JhengHei"/>
-          <w:sz w:val="21"/>
-        </w:rPr>
-        <w:t>先問對問題、分工、驗收、迭代這樣子。</w:t>
-      </w:r>
-    </w:p>
-    <w:p>
-      <w:pPr>
-        <w:pStyle w:val="Heading3"/>
-      </w:pPr>
-      <w:r>
-        <w:t>畫面 01:16–01:19</w:t>
-      </w:r>
-    </w:p>
-    <w:p>
-      <w:pPr>
-        <w:jc w:val="center"/>
-      </w:pPr>
-      <w:r>
-        <w:drawing>
-          <wp:inline xmlns:a="http://schemas.openxmlformats.org/drawingml/2006/main" xmlns:pic="http://schemas.openxmlformats.org/drawingml/2006/picture">
-            <wp:extent cx="4320000" cy="2430000"/>
-            <wp:docPr id="18" name="Picture 18"/>
-            <wp:cNvGraphicFramePr>
-              <a:graphicFrameLocks noChangeAspect="1"/>
-            </wp:cNvGraphicFramePr>
-            <a:graphic>
-              <a:graphicData uri="http://schemas.openxmlformats.org/drawingml/2006/picture">
-                <pic:pic>
-                  <pic:nvPicPr>
-                    <pic:cNvPr id="0" name="frame_0054.jpg"/>
-                    <pic:cNvPicPr/>
-                  </pic:nvPicPr>
-                  <pic:blipFill>
-                    <a:blip r:embed="rId27"/>
-                    <a:stretch>
-                      <a:fillRect/>
-                    </a:stretch>
-                  </pic:blipFill>
-                  <pic:spPr>
-                    <a:xfrm>
-                      <a:off x="0" y="0"/>
-                      <a:ext cx="4320000" cy="2430000"/>
-                    </a:xfrm>
-                    <a:prstGeom prst="rect"/>
-                  </pic:spPr>
-                </pic:pic>
-              </a:graphicData>
-            </a:graphic>
-          </wp:inline>
-        </w:drawing>
-      </w:r>
-    </w:p>
-    <w:p>
-      <w:r>
-        <w:rPr>
-          <w:rFonts w:ascii="Microsoft JhengHei" w:hAnsi="Microsoft JhengHei" w:eastAsia="Microsoft JhengHei"/>
-          <w:sz w:val="21"/>
-        </w:rPr>
-        <w:t>8點半大家看到那個文章上線的時候。</w:t>
-      </w:r>
-    </w:p>
-    <w:p>
-      <w:pPr>
-        <w:pStyle w:val="Heading3"/>
-      </w:pPr>
-      <w:r>
-        <w:t>畫面 01:19–01:26</w:t>
-      </w:r>
-    </w:p>
-    <w:p>
-      <w:pPr>
-        <w:jc w:val="center"/>
-      </w:pPr>
-      <w:r>
-        <w:drawing>
-          <wp:inline xmlns:a="http://schemas.openxmlformats.org/drawingml/2006/main" xmlns:pic="http://schemas.openxmlformats.org/drawingml/2006/picture">
-            <wp:extent cx="4320000" cy="2430000"/>
-            <wp:docPr id="19" name="Picture 19"/>
-            <wp:cNvGraphicFramePr>
-              <a:graphicFrameLocks noChangeAspect="1"/>
-            </wp:cNvGraphicFramePr>
-            <a:graphic>
-              <a:graphicData uri="http://schemas.openxmlformats.org/drawingml/2006/picture">
-                <pic:pic>
-                  <pic:nvPicPr>
-                    <pic:cNvPr id="0" name="frame_0056.jpg"/>
-                    <pic:cNvPicPr/>
-                  </pic:nvPicPr>
-                  <pic:blipFill>
-                    <a:blip r:embed="rId28"/>
-                    <a:stretch>
-                      <a:fillRect/>
-                    </a:stretch>
-                  </pic:blipFill>
-                  <pic:spPr>
-                    <a:xfrm>
-                      <a:off x="0" y="0"/>
-                      <a:ext cx="4320000" cy="2430000"/>
-                    </a:xfrm>
-                    <a:prstGeom prst="rect"/>
-                  </pic:spPr>
-                </pic:pic>
-              </a:graphicData>
-            </a:graphic>
-          </wp:inline>
-        </w:drawing>
-      </w:r>
-    </w:p>
-    <w:p>
-      <w:r>
-        <w:rPr>
-          <w:rFonts w:ascii="Microsoft JhengHei" w:hAnsi="Microsoft JhengHei" w:eastAsia="Microsoft JhengHei"/>
-          <w:sz w:val="21"/>
-        </w:rPr>
-        <w:t>就可以直接下載下來找一個音檔來自己測試看看。</w:t>
+        <w:t xml:space="preserve"> 課程宣傳結尾卡，無語音。</w:t>
       </w:r>
     </w:p>
     <w:p>

</xml_diff>

<commit_message>
Fix slide 2 start time (00:06) and summary table for video 1Er8dLDmTU
Co-Authored-By: Claude Sonnet 5.5 <noreply@anthropic.com>
Claude-Session: https://claude.ai/code/session_01AU333YXvwcrS2oXycGABJ3
</commit_message>
<xml_diff>
--- a/watch-output/2026-10-11_Facebook_AI逐字稿怎麼驗收不偷工_2小時免費體驗課__1Er8dLDmTU/2026-10-11_Facebook_AI逐字稿怎麼驗收不偷工_2小時免費體驗__1Er8dLDmTU_report.docx
+++ b/watch-output/2026-10-11_Facebook_AI逐字稿怎麼驗收不偷工_2小時免費體驗課__1Er8dLDmTU/2026-10-11_Facebook_AI逐字稿怎麼驗收不偷工_2小時免費體驗__1Er8dLDmTU_report.docx
@@ -198,7 +198,7 @@
                 <w:rFonts w:ascii="Microsoft JhengHei" w:hAnsi="Microsoft JhengHei" w:eastAsia="Microsoft JhengHei"/>
                 <w:sz w:val="19"/>
               </w:rPr>
-              <w:t>00:00–00:24</w:t>
+              <w:t>00:00–00:05</w:t>
             </w:r>
           </w:p>
         </w:tc>
@@ -213,7 +213,7 @@
                 <w:rFonts w:ascii="Microsoft JhengHei" w:hAnsi="Microsoft JhengHei" w:eastAsia="Microsoft JhengHei"/>
                 <w:sz w:val="19"/>
               </w:rPr>
-              <w:t>提出問題：如何確認 AI 沒有偷工減料？逐字稿要做成知識庫，每個字都重要，細節（故事、例子）最容易被刪掉；轉成 MD 檔時應逐字保留原文。</w:t>
+              <w:t>提出問題：如何確認 AI 沒有偷工減料？</w:t>
             </w:r>
           </w:p>
         </w:tc>
@@ -230,7 +230,7 @@
                 <w:rFonts w:ascii="Microsoft JhengHei" w:hAnsi="Microsoft JhengHei" w:eastAsia="Microsoft JhengHei"/>
                 <w:sz w:val="19"/>
               </w:rPr>
-              <w:t>00:25</w:t>
+              <w:t>00:06–00:25</w:t>
             </w:r>
           </w:p>
         </w:tc>
@@ -245,7 +245,7 @@
                 <w:rFonts w:ascii="Microsoft JhengHei" w:hAnsi="Microsoft JhengHei" w:eastAsia="Microsoft JhengHei"/>
                 <w:sz w:val="19"/>
               </w:rPr>
-              <w:t>投影片「別信『看起來做完了』」：逐字保留、分段處理、雙指標自我檢查、不覆寫原檔。</w:t>
+              <w:t>投影片「別信『看起來做完了』」出現（00:06 起），列出四道關卡：逐字保留、分段處理、雙指標自我檢查、不覆寫原檔。講者先談逐字保留：逐字稿要做成知識庫，每個字都重要，細節（故事、例子）最容易被刪掉；轉成 MD 檔時應逐字保留原文。</w:t>
             </w:r>
           </w:p>
         </w:tc>
@@ -497,7 +497,7 @@
           <w:rFonts w:ascii="Microsoft JhengHei" w:hAnsi="Microsoft JhengHei" w:eastAsia="Microsoft JhengHei"/>
           <w:sz w:val="21"/>
         </w:rPr>
-        <w:t>「教稿」→「逐字稿」（畫面標題與 00:25 投影片可交叉確認）。</w:t>
+        <w:t>「教稿」→「逐字稿」（畫面標題與 00:06 起的投影片可交叉確認）。</w:t>
       </w:r>
     </w:p>
     <w:p>
@@ -554,7 +554,7 @@
         <w:pStyle w:val="Heading3"/>
       </w:pPr>
       <w:r>
-        <w:t>投影片 1：AI 交出的逐字稿，你怎麼知道它沒偷工？（00:00–00:04）</w:t>
+        <w:t>投影片 1：AI 交出的逐字稿，你怎麼知道它沒偷工？（00:00–00:06）</w:t>
       </w:r>
     </w:p>
     <w:p>
@@ -636,7 +636,7 @@
           <w:rFonts w:ascii="Microsoft JhengHei" w:hAnsi="Microsoft JhengHei" w:eastAsia="Microsoft JhengHei"/>
           <w:sz w:val="21"/>
         </w:rPr>
-        <w:t>我們怎麼樣知道AI幫你做完這個逐字稿之後，它沒有偷工減料。</w:t>
+        <w:t>我們怎麼樣知道AI幫你做完這個逐字稿之後，它沒有偷工減料，我要能夠盡量把原文留下來。</w:t>
       </w:r>
     </w:p>
     <w:p>
@@ -644,7 +644,7 @@
         <w:pStyle w:val="Heading3"/>
       </w:pPr>
       <w:r>
-        <w:t>投影片 2：別信「看起來做完了」（00:04–00:52）</w:t>
+        <w:t>投影片 2：別信「看起來做完了」（00:06–00:52）</w:t>
       </w:r>
     </w:p>
     <w:p>
@@ -726,7 +726,7 @@
           <w:rFonts w:ascii="Microsoft JhengHei" w:hAnsi="Microsoft JhengHei" w:eastAsia="Microsoft JhengHei"/>
           <w:sz w:val="21"/>
         </w:rPr>
-        <w:t>我要能夠盡量把原文留下來，既然這個東西它有我做成知識庫的價值，每一個字就是都很重要，很有價值的東西會在某些例子的細節裡面，它可能很多的故事的細節就會被刪掉了，我覺得最厲害、最Juicy的地方就不見了，如果我想要轉成MD檔的東西，我都會希望它盡量保留成原文，一定要逐字保留，這是一個大原則，如果你真的要拿來做很長的檔案的話，後面逐字稿要分段處理，不會一次做一個大段，這東西都不用做，因為我都已經寫在技能包裡面了，這是我的思路，怎麼去拆解這個比較長的音檔，我後面裡面有做的就是雙指標的自我檢查，就是行數跟字數都要達標這個音檔有多長，它應該要有的容量跟行數字數大概是什麼。</w:t>
+        <w:t>既然這個東西它有我做成知識庫的價值，每一個字就是都很重要，很有價值的東西會在某些例子的細節裡面，它可能很多的故事的細節就會被刪掉了，我覺得最厲害、最Juicy的地方就不見了，如果我想要轉成MD檔的東西，我都會希望它盡量保留成原文，一定要逐字保留，這是一個大原則，如果你真的要拿來做很長的檔案的話，後面逐字稿要分段處理，不會一次做一個大段，這東西都不用做，因為我都已經寫在技能包裡面了，這是我的思路，怎麼去拆解這個比較長的音檔，我後面裡面有做的就是雙指標的自我檢查，就是行數跟字數都要達標這個音檔有多長，它應該要有的容量跟行數字數大概是什麼。</w:t>
       </w:r>
     </w:p>
     <w:p>

</xml_diff>

<commit_message>
Report: add Traditional Chinese translation under foreign-language transcript
- build_report reads optional transcript.zh.md (same [mm:ss] format) and
  prints a 中譯 paragraph under each section's original text
- Join English fragments with spaces; fix duplicated Chinese punctuation (。，/。。)
- Add zh translation for X video 2109141804620619953; document step in SKILL.md

Co-Authored-By: Claude Opus 5.5 <noreply@anthropic.com>
Claude-Session: https://claude.ai/code/session_01SEE21wwwfSrgwbhHd8rwzy
</commit_message>
<xml_diff>
--- a/watch-output/2026-10-11_Facebook_AI逐字稿怎麼驗收不偷工_2小時免費體驗課__1Er8dLDmTU/2026-10-11_Facebook_AI逐字稿怎麼驗收不偷工_2小時免費體驗__1Er8dLDmTU_report.docx
+++ b/watch-output/2026-10-11_Facebook_AI逐字稿怎麼驗收不偷工_2小時免費體驗課__1Er8dLDmTU/2026-10-11_Facebook_AI逐字稿怎麼驗收不偷工_2小時免費體驗__1Er8dLDmTU_report.docx
@@ -573,7 +573,7 @@
               <a:graphicData uri="http://schemas.openxmlformats.org/drawingml/2006/picture">
                 <pic:pic>
                   <pic:nvPicPr>
-                    <pic:cNvPr id="0" name="frame_0001.jpg"/>
+                    <pic:cNvPr id="0" name="image.jpg"/>
                     <pic:cNvPicPr/>
                   </pic:nvPicPr>
                   <pic:blipFill>
@@ -663,7 +663,7 @@
               <a:graphicData uri="http://schemas.openxmlformats.org/drawingml/2006/picture">
                 <pic:pic>
                   <pic:nvPicPr>
-                    <pic:cNvPr id="0" name="frame_0019.jpg"/>
+                    <pic:cNvPr id="0" name="image.jpg"/>
                     <pic:cNvPicPr/>
                   </pic:nvPicPr>
                   <pic:blipFill>
@@ -753,7 +753,7 @@
               <a:graphicData uri="http://schemas.openxmlformats.org/drawingml/2006/picture">
                 <pic:pic>
                   <pic:nvPicPr>
-                    <pic:cNvPr id="0" name="frame_0038.jpg"/>
+                    <pic:cNvPr id="0" name="image.jpg"/>
                     <pic:cNvPicPr/>
                   </pic:nvPicPr>
                   <pic:blipFill>
@@ -843,7 +843,7 @@
               <a:graphicData uri="http://schemas.openxmlformats.org/drawingml/2006/picture">
                 <pic:pic>
                   <pic:nvPicPr>
-                    <pic:cNvPr id="0" name="frame_0049.jpg"/>
+                    <pic:cNvPr id="0" name="image.jpg"/>
                     <pic:cNvPicPr/>
                   </pic:nvPicPr>
                   <pic:blipFill>
@@ -933,7 +933,7 @@
               <a:graphicData uri="http://schemas.openxmlformats.org/drawingml/2006/picture">
                 <pic:pic>
                   <pic:nvPicPr>
-                    <pic:cNvPr id="0" name="frame_0052.jpg"/>
+                    <pic:cNvPr id="0" name="image.jpg"/>
                     <pic:cNvPicPr/>
                   </pic:nvPicPr>
                   <pic:blipFill>
@@ -1023,7 +1023,7 @@
               <a:graphicData uri="http://schemas.openxmlformats.org/drawingml/2006/picture">
                 <pic:pic>
                   <pic:nvPicPr>
-                    <pic:cNvPr id="0" name="frame_0059.jpg"/>
+                    <pic:cNvPr id="0" name="image.jpg"/>
                     <pic:cNvPicPr/>
                   </pic:nvPicPr>
                   <pic:blipFill>

</xml_diff>